<commit_message>
D04: README, PRISMA PDF exported from Word, root index updated
Co-Authored-By: Claude Opus 5.5 <noreply@anthropic.com>
Claude-Session: https://claude.ai/code/session_01CsLFgwnuQK8yyd4UPD8vPc
</commit_message>
<xml_diff>
--- a/04_Systematic_Review/prisma/PRISMA_2020_flow_D04_Acosta.docx
+++ b/04_Systematic_Review/prisma/PRISMA_2020_flow_D04_Acosta.docx
@@ -2795,7 +2795,7 @@
                                 <w:sz w:val="18"/>
                                 <w:szCs w:val="20"/>
                               </w:rPr>
-                              <w:t xml:space="preserve">Studies included in review</w:t>
+                              <w:t xml:space="preserve">4 Studies included in review</w:t>
                             </w:r>
                           </w:p>
                           <w:p>
@@ -2900,7 +2900,7 @@
                           <w:sz w:val="18"/>
                           <w:szCs w:val="20"/>
                         </w:rPr>
-                        <w:t xml:space="preserve">Studies included in review</w:t>
+                        <w:t xml:space="preserve">4 Studies included in review</w:t>
                       </w:r>
                     </w:p>
                     <w:p>
@@ -3057,7 +3057,7 @@
                                 <w:sz w:val="18"/>
                                 <w:szCs w:val="18"/>
                               </w:rPr>
-                              <w:t xml:space="preserve">4 Included</w:t>
+                              <w:t xml:space="preserve">Included</w:t>
                             </w:r>
                           </w:p>
                         </w:txbxContent>
@@ -3105,7 +3105,7 @@
                           <w:sz w:val="18"/>
                           <w:szCs w:val="18"/>
                         </w:rPr>
-                        <w:t xml:space="preserve">4 Included</w:t>
+                        <w:t xml:space="preserve">Included</w:t>
                       </w:r>
                     </w:p>
                   </w:txbxContent>

</xml_diff>